<commit_message>
pre-trimming for final push
</commit_message>
<xml_diff>
--- a/Scale Paper revision plan.docx
+++ b/Scale Paper revision plan.docx
@@ -92,6 +92,29 @@
       </w:r>
       <w:r>
         <w:t xml:space="preserve">legitimate and not due to rare species. </w:t>
+      </w:r>
+    </w:p>
+    <w:p>
+      <w:pPr>
+        <w:pStyle w:val="ListParagraph"/>
+        <w:numPr>
+          <w:ilvl w:val="2"/>
+          <w:numId w:val="1"/>
+        </w:numPr>
+      </w:pPr>
+      <w:r>
+        <w:t xml:space="preserve">Consider asking GBIF if the species was seen in port </w:t>
+      </w:r>
+      <w:proofErr w:type="spellStart"/>
+      <w:r>
+        <w:t>fourchon</w:t>
+      </w:r>
+      <w:proofErr w:type="spellEnd"/>
+      <w:r>
+        <w:t xml:space="preserve"> or north </w:t>
+      </w:r>
+      <w:r>
+        <w:t xml:space="preserve">prior to 2005. </w:t>
       </w:r>
     </w:p>
     <w:p>

</xml_diff>